<commit_message>
Learn select and where
</commit_message>
<xml_diff>
--- a/section32_SQL/section32_SQLNotes.docx
+++ b/section32_SQL/section32_SQLNotes.docx
@@ -1054,6 +1054,160 @@
           <w:szCs w:val="28"/>
         </w:rPr>
       </w:pPr>
+      <w:r>
+        <w:rPr>
+          <w:rFonts w:ascii="Times New Roman" w:hAnsi="Times New Roman" w:cs="Times New Roman"/>
+          <w:b/>
+          <w:bCs/>
+          <w:sz w:val="28"/>
+          <w:szCs w:val="28"/>
+        </w:rPr>
+        <w:t xml:space="preserve">242. SQL Commands: READ, SELECT and </w:t>
+      </w:r>
+      <w:proofErr w:type="gramStart"/>
+      <w:r>
+        <w:rPr>
+          <w:rFonts w:ascii="Times New Roman" w:hAnsi="Times New Roman" w:cs="Times New Roman"/>
+          <w:b/>
+          <w:bCs/>
+          <w:sz w:val="28"/>
+          <w:szCs w:val="28"/>
+        </w:rPr>
+        <w:t>WHERE</w:t>
+      </w:r>
+      <w:proofErr w:type="gramEnd"/>
+    </w:p>
+    <w:p>
+      <w:pPr>
+        <w:pStyle w:val="ListParagraph"/>
+        <w:numPr>
+          <w:ilvl w:val="0"/>
+          <w:numId w:val="5"/>
+        </w:numPr>
+        <w:rPr>
+          <w:rFonts w:ascii="Times New Roman" w:hAnsi="Times New Roman" w:cs="Times New Roman"/>
+          <w:sz w:val="28"/>
+          <w:szCs w:val="28"/>
+        </w:rPr>
+      </w:pPr>
+      <w:r>
+        <w:rPr>
+          <w:rFonts w:ascii="Times New Roman" w:hAnsi="Times New Roman" w:cs="Times New Roman"/>
+          <w:sz w:val="28"/>
+          <w:szCs w:val="28"/>
+        </w:rPr>
+        <w:t>Selecting all columns:</w:t>
+      </w:r>
+    </w:p>
+    <w:p>
+      <w:pPr>
+        <w:pStyle w:val="ListParagraph"/>
+        <w:numPr>
+          <w:ilvl w:val="1"/>
+          <w:numId w:val="5"/>
+        </w:numPr>
+        <w:rPr>
+          <w:rFonts w:ascii="Times New Roman" w:hAnsi="Times New Roman" w:cs="Times New Roman"/>
+          <w:sz w:val="28"/>
+          <w:szCs w:val="28"/>
+        </w:rPr>
+      </w:pPr>
+      <w:r>
+        <w:rPr>
+          <w:rFonts w:ascii="Consolas" w:hAnsi="Consolas" w:cs="Courier New"/>
+          <w:sz w:val="28"/>
+          <w:szCs w:val="28"/>
+        </w:rPr>
+        <w:t>SELECT * FROM ‘products’;</w:t>
+      </w:r>
+    </w:p>
+    <w:p>
+      <w:pPr>
+        <w:pStyle w:val="ListParagraph"/>
+        <w:numPr>
+          <w:ilvl w:val="0"/>
+          <w:numId w:val="5"/>
+        </w:numPr>
+        <w:rPr>
+          <w:rFonts w:ascii="Times New Roman" w:hAnsi="Times New Roman" w:cs="Times New Roman"/>
+          <w:sz w:val="28"/>
+          <w:szCs w:val="28"/>
+        </w:rPr>
+      </w:pPr>
+      <w:r>
+        <w:rPr>
+          <w:rFonts w:ascii="Times New Roman" w:hAnsi="Times New Roman" w:cs="Times New Roman"/>
+          <w:sz w:val="28"/>
+          <w:szCs w:val="28"/>
+        </w:rPr>
+        <w:t>Select particular columns:</w:t>
+      </w:r>
+    </w:p>
+    <w:p>
+      <w:pPr>
+        <w:pStyle w:val="ListParagraph"/>
+        <w:numPr>
+          <w:ilvl w:val="1"/>
+          <w:numId w:val="5"/>
+        </w:numPr>
+        <w:rPr>
+          <w:rFonts w:ascii="Times New Roman" w:hAnsi="Times New Roman" w:cs="Times New Roman"/>
+          <w:sz w:val="28"/>
+          <w:szCs w:val="28"/>
+        </w:rPr>
+      </w:pPr>
+      <w:r>
+        <w:rPr>
+          <w:rFonts w:ascii="Consolas" w:hAnsi="Consolas" w:cs="Times New Roman"/>
+          <w:sz w:val="28"/>
+          <w:szCs w:val="28"/>
+        </w:rPr>
+        <w:t>SELECT name, price FROM ‘products’;</w:t>
+      </w:r>
+    </w:p>
+    <w:p>
+      <w:pPr>
+        <w:pStyle w:val="ListParagraph"/>
+        <w:numPr>
+          <w:ilvl w:val="0"/>
+          <w:numId w:val="5"/>
+        </w:numPr>
+        <w:rPr>
+          <w:rFonts w:ascii="Times New Roman" w:hAnsi="Times New Roman" w:cs="Times New Roman"/>
+          <w:sz w:val="28"/>
+          <w:szCs w:val="28"/>
+        </w:rPr>
+      </w:pPr>
+      <w:r>
+        <w:rPr>
+          <w:rFonts w:ascii="Times New Roman" w:hAnsi="Times New Roman" w:cs="Times New Roman"/>
+          <w:sz w:val="28"/>
+          <w:szCs w:val="28"/>
+        </w:rPr>
+        <w:t>Select columns based on a condition:</w:t>
+      </w:r>
+    </w:p>
+    <w:p>
+      <w:pPr>
+        <w:pStyle w:val="ListParagraph"/>
+        <w:numPr>
+          <w:ilvl w:val="1"/>
+          <w:numId w:val="5"/>
+        </w:numPr>
+        <w:rPr>
+          <w:rFonts w:ascii="Times New Roman" w:hAnsi="Times New Roman" w:cs="Times New Roman"/>
+          <w:sz w:val="28"/>
+          <w:szCs w:val="28"/>
+        </w:rPr>
+      </w:pPr>
+      <w:r>
+        <w:rPr>
+          <w:rFonts w:ascii="Consolas" w:hAnsi="Consolas" w:cs="Times New Roman"/>
+          <w:sz w:val="28"/>
+          <w:szCs w:val="28"/>
+        </w:rPr>
+        <w:t>SELECT * FROM ‘products’ WHERE id=1;</w:t>
+      </w:r>
     </w:p>
     <w:sectPr>
       <w:pgSz w:w="11906" w:h="16838"/>
@@ -1409,7 +1563,7 @@
   <w:abstractNum w:abstractNumId="3" w15:restartNumberingAfterBreak="0">
     <w:nsid w:val="51A45389"/>
     <w:multiLevelType w:val="hybridMultilevel"/>
-    <w:tmpl w:val="0F2AFF08"/>
+    <w:tmpl w:val="EEE0B152"/>
     <w:lvl w:ilvl="0" w:tplc="40090001">
       <w:start w:val="1"/>
       <w:numFmt w:val="bullet"/>

</xml_diff>

<commit_message>
Learn update and alter
</commit_message>
<xml_diff>
--- a/section32_SQL/section32_SQLNotes.docx
+++ b/section32_SQL/section32_SQLNotes.docx
@@ -1208,6 +1208,161 @@
         </w:rPr>
         <w:t>SELECT * FROM ‘products’ WHERE id=1;</w:t>
       </w:r>
+    </w:p>
+    <w:p>
+      <w:pPr>
+        <w:rPr>
+          <w:rFonts w:ascii="Times New Roman" w:hAnsi="Times New Roman" w:cs="Times New Roman"/>
+          <w:b/>
+          <w:bCs/>
+          <w:sz w:val="28"/>
+          <w:szCs w:val="28"/>
+        </w:rPr>
+      </w:pPr>
+      <w:r>
+        <w:rPr>
+          <w:rFonts w:ascii="Times New Roman" w:hAnsi="Times New Roman" w:cs="Times New Roman"/>
+          <w:b/>
+          <w:bCs/>
+          <w:sz w:val="28"/>
+          <w:szCs w:val="28"/>
+        </w:rPr>
+        <w:t>243. Updating Single Values and Adding Columns in SQL:</w:t>
+      </w:r>
+    </w:p>
+    <w:p>
+      <w:pPr>
+        <w:pStyle w:val="ListParagraph"/>
+        <w:numPr>
+          <w:ilvl w:val="0"/>
+          <w:numId w:val="6"/>
+        </w:numPr>
+        <w:rPr>
+          <w:rFonts w:ascii="Times New Roman" w:hAnsi="Times New Roman" w:cs="Times New Roman"/>
+          <w:b/>
+          <w:bCs/>
+          <w:sz w:val="28"/>
+          <w:szCs w:val="28"/>
+        </w:rPr>
+      </w:pPr>
+      <w:r>
+        <w:rPr>
+          <w:rFonts w:ascii="Times New Roman" w:hAnsi="Times New Roman" w:cs="Times New Roman"/>
+          <w:sz w:val="28"/>
+          <w:szCs w:val="28"/>
+        </w:rPr>
+        <w:t>Updating particular row in a column:</w:t>
+      </w:r>
+    </w:p>
+    <w:p>
+      <w:pPr>
+        <w:pStyle w:val="ListParagraph"/>
+        <w:numPr>
+          <w:ilvl w:val="1"/>
+          <w:numId w:val="6"/>
+        </w:numPr>
+        <w:rPr>
+          <w:rFonts w:ascii="Consolas" w:hAnsi="Consolas" w:cs="Times New Roman"/>
+          <w:b/>
+          <w:bCs/>
+          <w:sz w:val="28"/>
+          <w:szCs w:val="28"/>
+        </w:rPr>
+      </w:pPr>
+      <w:r>
+        <w:rPr>
+          <w:rFonts w:ascii="Consolas" w:hAnsi="Consolas" w:cs="Times New Roman"/>
+          <w:sz w:val="28"/>
+          <w:szCs w:val="28"/>
+        </w:rPr>
+        <w:t>UPDATE products</w:t>
+      </w:r>
+      <w:r>
+        <w:rPr>
+          <w:rFonts w:ascii="Consolas" w:hAnsi="Consolas" w:cs="Times New Roman"/>
+          <w:sz w:val="28"/>
+          <w:szCs w:val="28"/>
+        </w:rPr>
+        <w:br/>
+        <w:t>SET price = 0.08</w:t>
+      </w:r>
+      <w:r>
+        <w:rPr>
+          <w:rFonts w:ascii="Consolas" w:hAnsi="Consolas" w:cs="Times New Roman"/>
+          <w:sz w:val="28"/>
+          <w:szCs w:val="28"/>
+        </w:rPr>
+        <w:br/>
+        <w:t>WHERE id = 2;</w:t>
+      </w:r>
+    </w:p>
+    <w:p>
+      <w:pPr>
+        <w:pStyle w:val="ListParagraph"/>
+        <w:numPr>
+          <w:ilvl w:val="0"/>
+          <w:numId w:val="6"/>
+        </w:numPr>
+        <w:rPr>
+          <w:rFonts w:ascii="Times New Roman" w:hAnsi="Times New Roman" w:cs="Times New Roman"/>
+          <w:b/>
+          <w:bCs/>
+          <w:sz w:val="28"/>
+          <w:szCs w:val="28"/>
+        </w:rPr>
+      </w:pPr>
+      <w:r>
+        <w:rPr>
+          <w:rFonts w:ascii="Times New Roman" w:hAnsi="Times New Roman" w:cs="Times New Roman"/>
+          <w:sz w:val="28"/>
+          <w:szCs w:val="28"/>
+        </w:rPr>
+        <w:t>Change table:</w:t>
+      </w:r>
+    </w:p>
+    <w:p>
+      <w:pPr>
+        <w:pStyle w:val="ListParagraph"/>
+        <w:numPr>
+          <w:ilvl w:val="1"/>
+          <w:numId w:val="6"/>
+        </w:numPr>
+        <w:rPr>
+          <w:rFonts w:ascii="Consolas" w:hAnsi="Consolas" w:cs="Times New Roman"/>
+          <w:b/>
+          <w:bCs/>
+          <w:sz w:val="28"/>
+          <w:szCs w:val="28"/>
+        </w:rPr>
+      </w:pPr>
+      <w:r>
+        <w:rPr>
+          <w:rFonts w:ascii="Consolas" w:hAnsi="Consolas" w:cs="Times New Roman"/>
+          <w:sz w:val="28"/>
+          <w:szCs w:val="28"/>
+        </w:rPr>
+        <w:t>ALTER TABLE products</w:t>
+      </w:r>
+      <w:r>
+        <w:rPr>
+          <w:rFonts w:ascii="Consolas" w:hAnsi="Consolas" w:cs="Times New Roman"/>
+          <w:sz w:val="28"/>
+          <w:szCs w:val="28"/>
+        </w:rPr>
+        <w:br/>
+        <w:t>ADD stock int;</w:t>
+      </w:r>
+    </w:p>
+    <w:p>
+      <w:pPr>
+        <w:rPr>
+          <w:rFonts w:ascii="Times New Roman" w:hAnsi="Times New Roman" w:cs="Times New Roman"/>
+          <w:b/>
+          <w:bCs/>
+          <w:sz w:val="28"/>
+          <w:szCs w:val="28"/>
+        </w:rPr>
+      </w:pPr>
     </w:p>
     <w:sectPr>
       <w:pgSz w:w="11906" w:h="16838"/>
@@ -1335,6 +1490,119 @@
     </w:lvl>
   </w:abstractNum>
   <w:abstractNum w:abstractNumId="1" w15:restartNumberingAfterBreak="0">
+    <w:nsid w:val="255E4DCD"/>
+    <w:multiLevelType w:val="hybridMultilevel"/>
+    <w:tmpl w:val="F64A243C"/>
+    <w:lvl w:ilvl="0" w:tplc="40090001">
+      <w:start w:val="1"/>
+      <w:numFmt w:val="bullet"/>
+      <w:lvlText w:val=""/>
+      <w:lvlJc w:val="left"/>
+      <w:pPr>
+        <w:ind w:left="720" w:hanging="360"/>
+      </w:pPr>
+      <w:rPr>
+        <w:rFonts w:ascii="Symbol" w:hAnsi="Symbol" w:hint="default"/>
+      </w:rPr>
+    </w:lvl>
+    <w:lvl w:ilvl="1" w:tplc="40090003">
+      <w:start w:val="1"/>
+      <w:numFmt w:val="bullet"/>
+      <w:lvlText w:val="o"/>
+      <w:lvlJc w:val="left"/>
+      <w:pPr>
+        <w:ind w:left="1440" w:hanging="360"/>
+      </w:pPr>
+      <w:rPr>
+        <w:rFonts w:ascii="Courier New" w:hAnsi="Courier New" w:cs="Courier New" w:hint="default"/>
+      </w:rPr>
+    </w:lvl>
+    <w:lvl w:ilvl="2" w:tplc="40090005" w:tentative="1">
+      <w:start w:val="1"/>
+      <w:numFmt w:val="bullet"/>
+      <w:lvlText w:val=""/>
+      <w:lvlJc w:val="left"/>
+      <w:pPr>
+        <w:ind w:left="2160" w:hanging="360"/>
+      </w:pPr>
+      <w:rPr>
+        <w:rFonts w:ascii="Wingdings" w:hAnsi="Wingdings" w:hint="default"/>
+      </w:rPr>
+    </w:lvl>
+    <w:lvl w:ilvl="3" w:tplc="40090001" w:tentative="1">
+      <w:start w:val="1"/>
+      <w:numFmt w:val="bullet"/>
+      <w:lvlText w:val=""/>
+      <w:lvlJc w:val="left"/>
+      <w:pPr>
+        <w:ind w:left="2880" w:hanging="360"/>
+      </w:pPr>
+      <w:rPr>
+        <w:rFonts w:ascii="Symbol" w:hAnsi="Symbol" w:hint="default"/>
+      </w:rPr>
+    </w:lvl>
+    <w:lvl w:ilvl="4" w:tplc="40090003" w:tentative="1">
+      <w:start w:val="1"/>
+      <w:numFmt w:val="bullet"/>
+      <w:lvlText w:val="o"/>
+      <w:lvlJc w:val="left"/>
+      <w:pPr>
+        <w:ind w:left="3600" w:hanging="360"/>
+      </w:pPr>
+      <w:rPr>
+        <w:rFonts w:ascii="Courier New" w:hAnsi="Courier New" w:cs="Courier New" w:hint="default"/>
+      </w:rPr>
+    </w:lvl>
+    <w:lvl w:ilvl="5" w:tplc="40090005" w:tentative="1">
+      <w:start w:val="1"/>
+      <w:numFmt w:val="bullet"/>
+      <w:lvlText w:val=""/>
+      <w:lvlJc w:val="left"/>
+      <w:pPr>
+        <w:ind w:left="4320" w:hanging="360"/>
+      </w:pPr>
+      <w:rPr>
+        <w:rFonts w:ascii="Wingdings" w:hAnsi="Wingdings" w:hint="default"/>
+      </w:rPr>
+    </w:lvl>
+    <w:lvl w:ilvl="6" w:tplc="40090001" w:tentative="1">
+      <w:start w:val="1"/>
+      <w:numFmt w:val="bullet"/>
+      <w:lvlText w:val=""/>
+      <w:lvlJc w:val="left"/>
+      <w:pPr>
+        <w:ind w:left="5040" w:hanging="360"/>
+      </w:pPr>
+      <w:rPr>
+        <w:rFonts w:ascii="Symbol" w:hAnsi="Symbol" w:hint="default"/>
+      </w:rPr>
+    </w:lvl>
+    <w:lvl w:ilvl="7" w:tplc="40090003" w:tentative="1">
+      <w:start w:val="1"/>
+      <w:numFmt w:val="bullet"/>
+      <w:lvlText w:val="o"/>
+      <w:lvlJc w:val="left"/>
+      <w:pPr>
+        <w:ind w:left="5760" w:hanging="360"/>
+      </w:pPr>
+      <w:rPr>
+        <w:rFonts w:ascii="Courier New" w:hAnsi="Courier New" w:cs="Courier New" w:hint="default"/>
+      </w:rPr>
+    </w:lvl>
+    <w:lvl w:ilvl="8" w:tplc="40090005" w:tentative="1">
+      <w:start w:val="1"/>
+      <w:numFmt w:val="bullet"/>
+      <w:lvlText w:val=""/>
+      <w:lvlJc w:val="left"/>
+      <w:pPr>
+        <w:ind w:left="6480" w:hanging="360"/>
+      </w:pPr>
+      <w:rPr>
+        <w:rFonts w:ascii="Wingdings" w:hAnsi="Wingdings" w:hint="default"/>
+      </w:rPr>
+    </w:lvl>
+  </w:abstractNum>
+  <w:abstractNum w:abstractNumId="2" w15:restartNumberingAfterBreak="0">
     <w:nsid w:val="4A684534"/>
     <w:multiLevelType w:val="hybridMultilevel"/>
     <w:tmpl w:val="5D7262A8"/>
@@ -1447,7 +1715,7 @@
       </w:rPr>
     </w:lvl>
   </w:abstractNum>
-  <w:abstractNum w:abstractNumId="2" w15:restartNumberingAfterBreak="0">
+  <w:abstractNum w:abstractNumId="3" w15:restartNumberingAfterBreak="0">
     <w:nsid w:val="517A0F00"/>
     <w:multiLevelType w:val="hybridMultilevel"/>
     <w:tmpl w:val="5C6CF0A2"/>
@@ -1560,7 +1828,7 @@
       </w:rPr>
     </w:lvl>
   </w:abstractNum>
-  <w:abstractNum w:abstractNumId="3" w15:restartNumberingAfterBreak="0">
+  <w:abstractNum w:abstractNumId="4" w15:restartNumberingAfterBreak="0">
     <w:nsid w:val="51A45389"/>
     <w:multiLevelType w:val="hybridMultilevel"/>
     <w:tmpl w:val="EEE0B152"/>
@@ -1673,7 +1941,7 @@
       </w:rPr>
     </w:lvl>
   </w:abstractNum>
-  <w:abstractNum w:abstractNumId="4" w15:restartNumberingAfterBreak="0">
+  <w:abstractNum w:abstractNumId="5" w15:restartNumberingAfterBreak="0">
     <w:nsid w:val="5A1B0594"/>
     <w:multiLevelType w:val="hybridMultilevel"/>
     <w:tmpl w:val="74F8F352"/>
@@ -1790,16 +2058,19 @@
     <w:abstractNumId w:val="0"/>
   </w:num>
   <w:num w:numId="2" w16cid:durableId="2117407810">
+    <w:abstractNumId w:val="3"/>
+  </w:num>
+  <w:num w:numId="3" w16cid:durableId="771051917">
     <w:abstractNumId w:val="2"/>
   </w:num>
-  <w:num w:numId="3" w16cid:durableId="771051917">
-    <w:abstractNumId w:val="1"/>
+  <w:num w:numId="4" w16cid:durableId="1770930592">
+    <w:abstractNumId w:val="5"/>
   </w:num>
-  <w:num w:numId="4" w16cid:durableId="1770930592">
+  <w:num w:numId="5" w16cid:durableId="1488981167">
     <w:abstractNumId w:val="4"/>
   </w:num>
-  <w:num w:numId="5" w16cid:durableId="1488981167">
-    <w:abstractNumId w:val="3"/>
+  <w:num w:numId="6" w16cid:durableId="888147889">
+    <w:abstractNumId w:val="1"/>
   </w:num>
 </w:numbering>
 </file>

</xml_diff>

<commit_message>
Complete notes for section32
</commit_message>
<xml_diff>
--- a/section32_SQL/section32_SQLNotes.docx
+++ b/section32_SQL/section32_SQLNotes.docx
@@ -60,7 +60,25 @@
             <w:sz w:val="28"/>
             <w:szCs w:val="28"/>
           </w:rPr>
-          <w:t>https://www.w3schools.com/sql/</w:t>
+          <w:t>https://w</w:t>
+        </w:r>
+        <w:r>
+          <w:rPr>
+            <w:rStyle w:val="Hyperlink"/>
+            <w:rFonts w:ascii="Times New Roman" w:hAnsi="Times New Roman" w:cs="Times New Roman"/>
+            <w:sz w:val="28"/>
+            <w:szCs w:val="28"/>
+          </w:rPr>
+          <w:t>w</w:t>
+        </w:r>
+        <w:r>
+          <w:rPr>
+            <w:rStyle w:val="Hyperlink"/>
+            <w:rFonts w:ascii="Times New Roman" w:hAnsi="Times New Roman" w:cs="Times New Roman"/>
+            <w:sz w:val="28"/>
+            <w:szCs w:val="28"/>
+          </w:rPr>
+          <w:t>w.w3schools.com/sql/</w:t>
         </w:r>
       </w:hyperlink>
     </w:p>
@@ -1442,6 +1460,1301 @@
           <w:szCs w:val="28"/>
         </w:rPr>
       </w:pPr>
+      <w:r>
+        <w:rPr>
+          <w:rFonts w:ascii="Times New Roman" w:hAnsi="Times New Roman" w:cs="Times New Roman"/>
+          <w:b/>
+          <w:bCs/>
+          <w:sz w:val="28"/>
+          <w:szCs w:val="28"/>
+        </w:rPr>
+        <w:t>245. Understanding SQL Relationships, Foreign Keys and Inner Joins</w:t>
+      </w:r>
+    </w:p>
+    <w:p>
+      <w:pPr>
+        <w:pStyle w:val="ListParagraph"/>
+        <w:numPr>
+          <w:ilvl w:val="0"/>
+          <w:numId w:val="7"/>
+        </w:numPr>
+        <w:rPr>
+          <w:rFonts w:ascii="Times New Roman" w:hAnsi="Times New Roman" w:cs="Times New Roman"/>
+          <w:sz w:val="28"/>
+          <w:szCs w:val="28"/>
+        </w:rPr>
+      </w:pPr>
+      <w:r>
+        <w:rPr>
+          <w:rFonts w:ascii="Times New Roman" w:hAnsi="Times New Roman" w:cs="Times New Roman"/>
+          <w:sz w:val="28"/>
+          <w:szCs w:val="28"/>
+        </w:rPr>
+        <w:t>Foreign key:</w:t>
+      </w:r>
+    </w:p>
+    <w:p>
+      <w:pPr>
+        <w:shd w:val="clear" w:color="auto" w:fill="1F1F1F"/>
+        <w:spacing w:after="0" w:line="360" w:lineRule="atLeast"/>
+        <w:rPr>
+          <w:rFonts w:ascii="Consolas" w:eastAsia="Times New Roman" w:hAnsi="Consolas" w:cs="Times New Roman"/>
+          <w:color w:val="CCCCCC"/>
+          <w:kern w:val="0"/>
+          <w:sz w:val="27"/>
+          <w:szCs w:val="27"/>
+          <w:lang w:eastAsia="en-IN"/>
+          <w14:ligatures w14:val="none"/>
+        </w:rPr>
+      </w:pPr>
+      <w:r>
+        <w:rPr>
+          <w:rFonts w:ascii="Consolas" w:eastAsia="Times New Roman" w:hAnsi="Consolas" w:cs="Times New Roman"/>
+          <w:color w:val="569CD6"/>
+          <w:kern w:val="0"/>
+          <w:sz w:val="27"/>
+          <w:szCs w:val="27"/>
+          <w:lang w:eastAsia="en-IN"/>
+          <w14:ligatures w14:val="none"/>
+        </w:rPr>
+        <w:t>CREATE</w:t>
+      </w:r>
+      <w:r>
+        <w:rPr>
+          <w:rFonts w:ascii="Consolas" w:eastAsia="Times New Roman" w:hAnsi="Consolas" w:cs="Times New Roman"/>
+          <w:color w:val="CCCCCC"/>
+          <w:kern w:val="0"/>
+          <w:sz w:val="27"/>
+          <w:szCs w:val="27"/>
+          <w:lang w:eastAsia="en-IN"/>
+          <w14:ligatures w14:val="none"/>
+        </w:rPr>
+        <w:t xml:space="preserve"> </w:t>
+      </w:r>
+      <w:r>
+        <w:rPr>
+          <w:rFonts w:ascii="Consolas" w:eastAsia="Times New Roman" w:hAnsi="Consolas" w:cs="Times New Roman"/>
+          <w:color w:val="569CD6"/>
+          <w:kern w:val="0"/>
+          <w:sz w:val="27"/>
+          <w:szCs w:val="27"/>
+          <w:lang w:eastAsia="en-IN"/>
+          <w14:ligatures w14:val="none"/>
+        </w:rPr>
+        <w:t>TABLE</w:t>
+      </w:r>
+      <w:r>
+        <w:rPr>
+          <w:rFonts w:ascii="Consolas" w:eastAsia="Times New Roman" w:hAnsi="Consolas" w:cs="Times New Roman"/>
+          <w:color w:val="CCCCCC"/>
+          <w:kern w:val="0"/>
+          <w:sz w:val="27"/>
+          <w:szCs w:val="27"/>
+          <w:lang w:eastAsia="en-IN"/>
+          <w14:ligatures w14:val="none"/>
+        </w:rPr>
+        <w:t xml:space="preserve"> </w:t>
+      </w:r>
+      <w:r>
+        <w:rPr>
+          <w:rFonts w:ascii="Consolas" w:eastAsia="Times New Roman" w:hAnsi="Consolas" w:cs="Times New Roman"/>
+          <w:color w:val="DCDCAA"/>
+          <w:kern w:val="0"/>
+          <w:sz w:val="27"/>
+          <w:szCs w:val="27"/>
+          <w:lang w:eastAsia="en-IN"/>
+          <w14:ligatures w14:val="none"/>
+        </w:rPr>
+        <w:t>Orders</w:t>
+      </w:r>
+      <w:r>
+        <w:rPr>
+          <w:rFonts w:ascii="Consolas" w:eastAsia="Times New Roman" w:hAnsi="Consolas" w:cs="Times New Roman"/>
+          <w:color w:val="CCCCCC"/>
+          <w:kern w:val="0"/>
+          <w:sz w:val="27"/>
+          <w:szCs w:val="27"/>
+          <w:lang w:eastAsia="en-IN"/>
+          <w14:ligatures w14:val="none"/>
+        </w:rPr>
+        <w:t xml:space="preserve"> (</w:t>
+      </w:r>
+    </w:p>
+    <w:p>
+      <w:pPr>
+        <w:shd w:val="clear" w:color="auto" w:fill="1F1F1F"/>
+        <w:spacing w:after="0" w:line="360" w:lineRule="atLeast"/>
+        <w:rPr>
+          <w:rFonts w:ascii="Consolas" w:eastAsia="Times New Roman" w:hAnsi="Consolas" w:cs="Times New Roman"/>
+          <w:color w:val="CCCCCC"/>
+          <w:kern w:val="0"/>
+          <w:sz w:val="27"/>
+          <w:szCs w:val="27"/>
+          <w:lang w:eastAsia="en-IN"/>
+          <w14:ligatures w14:val="none"/>
+        </w:rPr>
+      </w:pPr>
+      <w:r>
+        <w:rPr>
+          <w:rFonts w:ascii="Consolas" w:eastAsia="Times New Roman" w:hAnsi="Consolas" w:cs="Times New Roman"/>
+          <w:color w:val="CCCCCC"/>
+          <w:kern w:val="0"/>
+          <w:sz w:val="27"/>
+          <w:szCs w:val="27"/>
+          <w:lang w:eastAsia="en-IN"/>
+          <w14:ligatures w14:val="none"/>
+        </w:rPr>
+        <w:t xml:space="preserve">    </w:t>
+      </w:r>
+      <w:proofErr w:type="spellStart"/>
+      <w:r>
+        <w:rPr>
+          <w:rFonts w:ascii="Consolas" w:eastAsia="Times New Roman" w:hAnsi="Consolas" w:cs="Times New Roman"/>
+          <w:color w:val="CCCCCC"/>
+          <w:kern w:val="0"/>
+          <w:sz w:val="27"/>
+          <w:szCs w:val="27"/>
+          <w:lang w:eastAsia="en-IN"/>
+          <w14:ligatures w14:val="none"/>
+        </w:rPr>
+        <w:t>OrderID</w:t>
+      </w:r>
+      <w:proofErr w:type="spellEnd"/>
+      <w:r>
+        <w:rPr>
+          <w:rFonts w:ascii="Consolas" w:eastAsia="Times New Roman" w:hAnsi="Consolas" w:cs="Times New Roman"/>
+          <w:color w:val="CCCCCC"/>
+          <w:kern w:val="0"/>
+          <w:sz w:val="27"/>
+          <w:szCs w:val="27"/>
+          <w:lang w:eastAsia="en-IN"/>
+          <w14:ligatures w14:val="none"/>
+        </w:rPr>
+        <w:t xml:space="preserve"> </w:t>
+      </w:r>
+      <w:r>
+        <w:rPr>
+          <w:rFonts w:ascii="Consolas" w:eastAsia="Times New Roman" w:hAnsi="Consolas" w:cs="Times New Roman"/>
+          <w:color w:val="569CD6"/>
+          <w:kern w:val="0"/>
+          <w:sz w:val="27"/>
+          <w:szCs w:val="27"/>
+          <w:lang w:eastAsia="en-IN"/>
+          <w14:ligatures w14:val="none"/>
+        </w:rPr>
+        <w:t>int</w:t>
+      </w:r>
+      <w:r>
+        <w:rPr>
+          <w:rFonts w:ascii="Consolas" w:eastAsia="Times New Roman" w:hAnsi="Consolas" w:cs="Times New Roman"/>
+          <w:color w:val="CCCCCC"/>
+          <w:kern w:val="0"/>
+          <w:sz w:val="27"/>
+          <w:szCs w:val="27"/>
+          <w:lang w:eastAsia="en-IN"/>
+          <w14:ligatures w14:val="none"/>
+        </w:rPr>
+        <w:t xml:space="preserve"> </w:t>
+      </w:r>
+      <w:r>
+        <w:rPr>
+          <w:rFonts w:ascii="Consolas" w:eastAsia="Times New Roman" w:hAnsi="Consolas" w:cs="Times New Roman"/>
+          <w:color w:val="569CD6"/>
+          <w:kern w:val="0"/>
+          <w:sz w:val="27"/>
+          <w:szCs w:val="27"/>
+          <w:lang w:eastAsia="en-IN"/>
+          <w14:ligatures w14:val="none"/>
+        </w:rPr>
+        <w:t>NOT NULL</w:t>
+      </w:r>
+      <w:r>
+        <w:rPr>
+          <w:rFonts w:ascii="Consolas" w:eastAsia="Times New Roman" w:hAnsi="Consolas" w:cs="Times New Roman"/>
+          <w:color w:val="CCCCCC"/>
+          <w:kern w:val="0"/>
+          <w:sz w:val="27"/>
+          <w:szCs w:val="27"/>
+          <w:lang w:eastAsia="en-IN"/>
+          <w14:ligatures w14:val="none"/>
+        </w:rPr>
+        <w:t>,</w:t>
+      </w:r>
+    </w:p>
+    <w:p>
+      <w:pPr>
+        <w:shd w:val="clear" w:color="auto" w:fill="1F1F1F"/>
+        <w:spacing w:after="0" w:line="360" w:lineRule="atLeast"/>
+        <w:rPr>
+          <w:rFonts w:ascii="Consolas" w:eastAsia="Times New Roman" w:hAnsi="Consolas" w:cs="Times New Roman"/>
+          <w:color w:val="CCCCCC"/>
+          <w:kern w:val="0"/>
+          <w:sz w:val="27"/>
+          <w:szCs w:val="27"/>
+          <w:lang w:eastAsia="en-IN"/>
+          <w14:ligatures w14:val="none"/>
+        </w:rPr>
+      </w:pPr>
+      <w:r>
+        <w:rPr>
+          <w:rFonts w:ascii="Consolas" w:eastAsia="Times New Roman" w:hAnsi="Consolas" w:cs="Times New Roman"/>
+          <w:color w:val="CCCCCC"/>
+          <w:kern w:val="0"/>
+          <w:sz w:val="27"/>
+          <w:szCs w:val="27"/>
+          <w:lang w:eastAsia="en-IN"/>
+          <w14:ligatures w14:val="none"/>
+        </w:rPr>
+        <w:t xml:space="preserve">    </w:t>
+      </w:r>
+      <w:proofErr w:type="spellStart"/>
+      <w:r>
+        <w:rPr>
+          <w:rFonts w:ascii="Consolas" w:eastAsia="Times New Roman" w:hAnsi="Consolas" w:cs="Times New Roman"/>
+          <w:color w:val="CCCCCC"/>
+          <w:kern w:val="0"/>
+          <w:sz w:val="27"/>
+          <w:szCs w:val="27"/>
+          <w:lang w:eastAsia="en-IN"/>
+          <w14:ligatures w14:val="none"/>
+        </w:rPr>
+        <w:t>OrderNumber</w:t>
+      </w:r>
+      <w:proofErr w:type="spellEnd"/>
+      <w:r>
+        <w:rPr>
+          <w:rFonts w:ascii="Consolas" w:eastAsia="Times New Roman" w:hAnsi="Consolas" w:cs="Times New Roman"/>
+          <w:color w:val="CCCCCC"/>
+          <w:kern w:val="0"/>
+          <w:sz w:val="27"/>
+          <w:szCs w:val="27"/>
+          <w:lang w:eastAsia="en-IN"/>
+          <w14:ligatures w14:val="none"/>
+        </w:rPr>
+        <w:t xml:space="preserve"> </w:t>
+      </w:r>
+      <w:r>
+        <w:rPr>
+          <w:rFonts w:ascii="Consolas" w:eastAsia="Times New Roman" w:hAnsi="Consolas" w:cs="Times New Roman"/>
+          <w:color w:val="569CD6"/>
+          <w:kern w:val="0"/>
+          <w:sz w:val="27"/>
+          <w:szCs w:val="27"/>
+          <w:lang w:eastAsia="en-IN"/>
+          <w14:ligatures w14:val="none"/>
+        </w:rPr>
+        <w:t>int</w:t>
+      </w:r>
+      <w:r>
+        <w:rPr>
+          <w:rFonts w:ascii="Consolas" w:eastAsia="Times New Roman" w:hAnsi="Consolas" w:cs="Times New Roman"/>
+          <w:color w:val="CCCCCC"/>
+          <w:kern w:val="0"/>
+          <w:sz w:val="27"/>
+          <w:szCs w:val="27"/>
+          <w:lang w:eastAsia="en-IN"/>
+          <w14:ligatures w14:val="none"/>
+        </w:rPr>
+        <w:t xml:space="preserve"> </w:t>
+      </w:r>
+      <w:r>
+        <w:rPr>
+          <w:rFonts w:ascii="Consolas" w:eastAsia="Times New Roman" w:hAnsi="Consolas" w:cs="Times New Roman"/>
+          <w:color w:val="569CD6"/>
+          <w:kern w:val="0"/>
+          <w:sz w:val="27"/>
+          <w:szCs w:val="27"/>
+          <w:lang w:eastAsia="en-IN"/>
+          <w14:ligatures w14:val="none"/>
+        </w:rPr>
+        <w:t>NOT NULL</w:t>
+      </w:r>
+      <w:r>
+        <w:rPr>
+          <w:rFonts w:ascii="Consolas" w:eastAsia="Times New Roman" w:hAnsi="Consolas" w:cs="Times New Roman"/>
+          <w:color w:val="CCCCCC"/>
+          <w:kern w:val="0"/>
+          <w:sz w:val="27"/>
+          <w:szCs w:val="27"/>
+          <w:lang w:eastAsia="en-IN"/>
+          <w14:ligatures w14:val="none"/>
+        </w:rPr>
+        <w:t>,</w:t>
+      </w:r>
+    </w:p>
+    <w:p>
+      <w:pPr>
+        <w:shd w:val="clear" w:color="auto" w:fill="1F1F1F"/>
+        <w:spacing w:after="0" w:line="360" w:lineRule="atLeast"/>
+        <w:rPr>
+          <w:rFonts w:ascii="Consolas" w:eastAsia="Times New Roman" w:hAnsi="Consolas" w:cs="Times New Roman"/>
+          <w:color w:val="CCCCCC"/>
+          <w:kern w:val="0"/>
+          <w:sz w:val="27"/>
+          <w:szCs w:val="27"/>
+          <w:lang w:eastAsia="en-IN"/>
+          <w14:ligatures w14:val="none"/>
+        </w:rPr>
+      </w:pPr>
+      <w:r>
+        <w:rPr>
+          <w:rFonts w:ascii="Consolas" w:eastAsia="Times New Roman" w:hAnsi="Consolas" w:cs="Times New Roman"/>
+          <w:color w:val="CCCCCC"/>
+          <w:kern w:val="0"/>
+          <w:sz w:val="27"/>
+          <w:szCs w:val="27"/>
+          <w:lang w:eastAsia="en-IN"/>
+          <w14:ligatures w14:val="none"/>
+        </w:rPr>
+        <w:t xml:space="preserve">    </w:t>
+      </w:r>
+      <w:proofErr w:type="spellStart"/>
+      <w:r>
+        <w:rPr>
+          <w:rFonts w:ascii="Consolas" w:eastAsia="Times New Roman" w:hAnsi="Consolas" w:cs="Times New Roman"/>
+          <w:color w:val="CCCCCC"/>
+          <w:kern w:val="0"/>
+          <w:sz w:val="27"/>
+          <w:szCs w:val="27"/>
+          <w:lang w:eastAsia="en-IN"/>
+          <w14:ligatures w14:val="none"/>
+        </w:rPr>
+        <w:t>PersonID</w:t>
+      </w:r>
+      <w:proofErr w:type="spellEnd"/>
+      <w:r>
+        <w:rPr>
+          <w:rFonts w:ascii="Consolas" w:eastAsia="Times New Roman" w:hAnsi="Consolas" w:cs="Times New Roman"/>
+          <w:color w:val="CCCCCC"/>
+          <w:kern w:val="0"/>
+          <w:sz w:val="27"/>
+          <w:szCs w:val="27"/>
+          <w:lang w:eastAsia="en-IN"/>
+          <w14:ligatures w14:val="none"/>
+        </w:rPr>
+        <w:t xml:space="preserve"> </w:t>
+      </w:r>
+      <w:r>
+        <w:rPr>
+          <w:rFonts w:ascii="Consolas" w:eastAsia="Times New Roman" w:hAnsi="Consolas" w:cs="Times New Roman"/>
+          <w:color w:val="569CD6"/>
+          <w:kern w:val="0"/>
+          <w:sz w:val="27"/>
+          <w:szCs w:val="27"/>
+          <w:lang w:eastAsia="en-IN"/>
+          <w14:ligatures w14:val="none"/>
+        </w:rPr>
+        <w:t>int</w:t>
+      </w:r>
+      <w:r>
+        <w:rPr>
+          <w:rFonts w:ascii="Consolas" w:eastAsia="Times New Roman" w:hAnsi="Consolas" w:cs="Times New Roman"/>
+          <w:color w:val="CCCCCC"/>
+          <w:kern w:val="0"/>
+          <w:sz w:val="27"/>
+          <w:szCs w:val="27"/>
+          <w:lang w:eastAsia="en-IN"/>
+          <w14:ligatures w14:val="none"/>
+        </w:rPr>
+        <w:t>,</w:t>
+      </w:r>
+    </w:p>
+    <w:p>
+      <w:pPr>
+        <w:shd w:val="clear" w:color="auto" w:fill="1F1F1F"/>
+        <w:spacing w:after="0" w:line="360" w:lineRule="atLeast"/>
+        <w:rPr>
+          <w:rFonts w:ascii="Consolas" w:eastAsia="Times New Roman" w:hAnsi="Consolas" w:cs="Times New Roman"/>
+          <w:color w:val="CCCCCC"/>
+          <w:kern w:val="0"/>
+          <w:sz w:val="27"/>
+          <w:szCs w:val="27"/>
+          <w:lang w:eastAsia="en-IN"/>
+          <w14:ligatures w14:val="none"/>
+        </w:rPr>
+      </w:pPr>
+      <w:r>
+        <w:rPr>
+          <w:rFonts w:ascii="Consolas" w:eastAsia="Times New Roman" w:hAnsi="Consolas" w:cs="Times New Roman"/>
+          <w:color w:val="CCCCCC"/>
+          <w:kern w:val="0"/>
+          <w:sz w:val="27"/>
+          <w:szCs w:val="27"/>
+          <w:lang w:eastAsia="en-IN"/>
+          <w14:ligatures w14:val="none"/>
+        </w:rPr>
+        <w:t xml:space="preserve">    </w:t>
+      </w:r>
+      <w:r>
+        <w:rPr>
+          <w:rFonts w:ascii="Consolas" w:eastAsia="Times New Roman" w:hAnsi="Consolas" w:cs="Times New Roman"/>
+          <w:color w:val="569CD6"/>
+          <w:kern w:val="0"/>
+          <w:sz w:val="27"/>
+          <w:szCs w:val="27"/>
+          <w:lang w:eastAsia="en-IN"/>
+          <w14:ligatures w14:val="none"/>
+        </w:rPr>
+        <w:t>PRIMARY KEY</w:t>
+      </w:r>
+      <w:r>
+        <w:rPr>
+          <w:rFonts w:ascii="Consolas" w:eastAsia="Times New Roman" w:hAnsi="Consolas" w:cs="Times New Roman"/>
+          <w:color w:val="CCCCCC"/>
+          <w:kern w:val="0"/>
+          <w:sz w:val="27"/>
+          <w:szCs w:val="27"/>
+          <w:lang w:eastAsia="en-IN"/>
+          <w14:ligatures w14:val="none"/>
+        </w:rPr>
+        <w:t xml:space="preserve"> (</w:t>
+      </w:r>
+      <w:proofErr w:type="spellStart"/>
+      <w:r>
+        <w:rPr>
+          <w:rFonts w:ascii="Consolas" w:eastAsia="Times New Roman" w:hAnsi="Consolas" w:cs="Times New Roman"/>
+          <w:color w:val="CCCCCC"/>
+          <w:kern w:val="0"/>
+          <w:sz w:val="27"/>
+          <w:szCs w:val="27"/>
+          <w:lang w:eastAsia="en-IN"/>
+          <w14:ligatures w14:val="none"/>
+        </w:rPr>
+        <w:t>OrderID</w:t>
+      </w:r>
+      <w:proofErr w:type="spellEnd"/>
+      <w:r>
+        <w:rPr>
+          <w:rFonts w:ascii="Consolas" w:eastAsia="Times New Roman" w:hAnsi="Consolas" w:cs="Times New Roman"/>
+          <w:color w:val="CCCCCC"/>
+          <w:kern w:val="0"/>
+          <w:sz w:val="27"/>
+          <w:szCs w:val="27"/>
+          <w:lang w:eastAsia="en-IN"/>
+          <w14:ligatures w14:val="none"/>
+        </w:rPr>
+        <w:t>),</w:t>
+      </w:r>
+    </w:p>
+    <w:p>
+      <w:pPr>
+        <w:shd w:val="clear" w:color="auto" w:fill="1F1F1F"/>
+        <w:spacing w:after="0" w:line="360" w:lineRule="atLeast"/>
+        <w:rPr>
+          <w:rFonts w:ascii="Consolas" w:eastAsia="Times New Roman" w:hAnsi="Consolas" w:cs="Times New Roman"/>
+          <w:color w:val="CCCCCC"/>
+          <w:kern w:val="0"/>
+          <w:sz w:val="27"/>
+          <w:szCs w:val="27"/>
+          <w:lang w:eastAsia="en-IN"/>
+          <w14:ligatures w14:val="none"/>
+        </w:rPr>
+      </w:pPr>
+      <w:r>
+        <w:rPr>
+          <w:rFonts w:ascii="Consolas" w:eastAsia="Times New Roman" w:hAnsi="Consolas" w:cs="Times New Roman"/>
+          <w:color w:val="CCCCCC"/>
+          <w:kern w:val="0"/>
+          <w:sz w:val="27"/>
+          <w:szCs w:val="27"/>
+          <w:lang w:eastAsia="en-IN"/>
+          <w14:ligatures w14:val="none"/>
+        </w:rPr>
+        <w:t xml:space="preserve">    </w:t>
+      </w:r>
+      <w:r>
+        <w:rPr>
+          <w:rFonts w:ascii="Consolas" w:eastAsia="Times New Roman" w:hAnsi="Consolas" w:cs="Times New Roman"/>
+          <w:color w:val="569CD6"/>
+          <w:kern w:val="0"/>
+          <w:sz w:val="27"/>
+          <w:szCs w:val="27"/>
+          <w:lang w:eastAsia="en-IN"/>
+          <w14:ligatures w14:val="none"/>
+        </w:rPr>
+        <w:t>FOREIGN KEY</w:t>
+      </w:r>
+      <w:r>
+        <w:rPr>
+          <w:rFonts w:ascii="Consolas" w:eastAsia="Times New Roman" w:hAnsi="Consolas" w:cs="Times New Roman"/>
+          <w:color w:val="CCCCCC"/>
+          <w:kern w:val="0"/>
+          <w:sz w:val="27"/>
+          <w:szCs w:val="27"/>
+          <w:lang w:eastAsia="en-IN"/>
+          <w14:ligatures w14:val="none"/>
+        </w:rPr>
+        <w:t xml:space="preserve"> (</w:t>
+      </w:r>
+      <w:proofErr w:type="spellStart"/>
+      <w:r>
+        <w:rPr>
+          <w:rFonts w:ascii="Consolas" w:eastAsia="Times New Roman" w:hAnsi="Consolas" w:cs="Times New Roman"/>
+          <w:color w:val="CCCCCC"/>
+          <w:kern w:val="0"/>
+          <w:sz w:val="27"/>
+          <w:szCs w:val="27"/>
+          <w:lang w:eastAsia="en-IN"/>
+          <w14:ligatures w14:val="none"/>
+        </w:rPr>
+        <w:t>PersonID</w:t>
+      </w:r>
+      <w:proofErr w:type="spellEnd"/>
+      <w:r>
+        <w:rPr>
+          <w:rFonts w:ascii="Consolas" w:eastAsia="Times New Roman" w:hAnsi="Consolas" w:cs="Times New Roman"/>
+          <w:color w:val="CCCCCC"/>
+          <w:kern w:val="0"/>
+          <w:sz w:val="27"/>
+          <w:szCs w:val="27"/>
+          <w:lang w:eastAsia="en-IN"/>
+          <w14:ligatures w14:val="none"/>
+        </w:rPr>
+        <w:t xml:space="preserve">) </w:t>
+      </w:r>
+      <w:r>
+        <w:rPr>
+          <w:rFonts w:ascii="Consolas" w:eastAsia="Times New Roman" w:hAnsi="Consolas" w:cs="Times New Roman"/>
+          <w:color w:val="569CD6"/>
+          <w:kern w:val="0"/>
+          <w:sz w:val="27"/>
+          <w:szCs w:val="27"/>
+          <w:lang w:eastAsia="en-IN"/>
+          <w14:ligatures w14:val="none"/>
+        </w:rPr>
+        <w:t>REFERENCES</w:t>
+      </w:r>
+      <w:r>
+        <w:rPr>
+          <w:rFonts w:ascii="Consolas" w:eastAsia="Times New Roman" w:hAnsi="Consolas" w:cs="Times New Roman"/>
+          <w:color w:val="CCCCCC"/>
+          <w:kern w:val="0"/>
+          <w:sz w:val="27"/>
+          <w:szCs w:val="27"/>
+          <w:lang w:eastAsia="en-IN"/>
+          <w14:ligatures w14:val="none"/>
+        </w:rPr>
+        <w:t xml:space="preserve"> Persons(</w:t>
+      </w:r>
+      <w:proofErr w:type="spellStart"/>
+      <w:r>
+        <w:rPr>
+          <w:rFonts w:ascii="Consolas" w:eastAsia="Times New Roman" w:hAnsi="Consolas" w:cs="Times New Roman"/>
+          <w:color w:val="CCCCCC"/>
+          <w:kern w:val="0"/>
+          <w:sz w:val="27"/>
+          <w:szCs w:val="27"/>
+          <w:lang w:eastAsia="en-IN"/>
+          <w14:ligatures w14:val="none"/>
+        </w:rPr>
+        <w:t>PersonID</w:t>
+      </w:r>
+      <w:proofErr w:type="spellEnd"/>
+      <w:r>
+        <w:rPr>
+          <w:rFonts w:ascii="Consolas" w:eastAsia="Times New Roman" w:hAnsi="Consolas" w:cs="Times New Roman"/>
+          <w:color w:val="CCCCCC"/>
+          <w:kern w:val="0"/>
+          <w:sz w:val="27"/>
+          <w:szCs w:val="27"/>
+          <w:lang w:eastAsia="en-IN"/>
+          <w14:ligatures w14:val="none"/>
+        </w:rPr>
+        <w:t>)</w:t>
+      </w:r>
+    </w:p>
+    <w:p>
+      <w:pPr>
+        <w:shd w:val="clear" w:color="auto" w:fill="1F1F1F"/>
+        <w:spacing w:after="0" w:line="360" w:lineRule="atLeast"/>
+        <w:rPr>
+          <w:rFonts w:ascii="Consolas" w:eastAsia="Times New Roman" w:hAnsi="Consolas" w:cs="Times New Roman"/>
+          <w:color w:val="CCCCCC"/>
+          <w:kern w:val="0"/>
+          <w:sz w:val="27"/>
+          <w:szCs w:val="27"/>
+          <w:lang w:eastAsia="en-IN"/>
+          <w14:ligatures w14:val="none"/>
+        </w:rPr>
+      </w:pPr>
+      <w:r>
+        <w:rPr>
+          <w:rFonts w:ascii="Consolas" w:eastAsia="Times New Roman" w:hAnsi="Consolas" w:cs="Times New Roman"/>
+          <w:color w:val="CCCCCC"/>
+          <w:kern w:val="0"/>
+          <w:sz w:val="27"/>
+          <w:szCs w:val="27"/>
+          <w:lang w:eastAsia="en-IN"/>
+          <w14:ligatures w14:val="none"/>
+        </w:rPr>
+        <w:t>);</w:t>
+      </w:r>
+    </w:p>
+    <w:p>
+      <w:pPr>
+        <w:shd w:val="clear" w:color="auto" w:fill="1F1F1F"/>
+        <w:spacing w:after="0" w:line="360" w:lineRule="atLeast"/>
+        <w:rPr>
+          <w:rFonts w:ascii="Consolas" w:eastAsia="Times New Roman" w:hAnsi="Consolas" w:cs="Times New Roman"/>
+          <w:color w:val="CCCCCC"/>
+          <w:kern w:val="0"/>
+          <w:sz w:val="27"/>
+          <w:szCs w:val="27"/>
+          <w:lang w:eastAsia="en-IN"/>
+          <w14:ligatures w14:val="none"/>
+        </w:rPr>
+      </w:pPr>
+    </w:p>
+    <w:p>
+      <w:pPr>
+        <w:shd w:val="clear" w:color="auto" w:fill="1F1F1F"/>
+        <w:spacing w:after="0" w:line="360" w:lineRule="atLeast"/>
+        <w:rPr>
+          <w:rFonts w:ascii="Consolas" w:eastAsia="Times New Roman" w:hAnsi="Consolas" w:cs="Times New Roman"/>
+          <w:color w:val="CCCCCC"/>
+          <w:kern w:val="0"/>
+          <w:sz w:val="27"/>
+          <w:szCs w:val="27"/>
+          <w:lang w:eastAsia="en-IN"/>
+          <w14:ligatures w14:val="none"/>
+        </w:rPr>
+      </w:pPr>
+      <w:r>
+        <w:rPr>
+          <w:rFonts w:ascii="Consolas" w:eastAsia="Times New Roman" w:hAnsi="Consolas" w:cs="Times New Roman"/>
+          <w:color w:val="569CD6"/>
+          <w:kern w:val="0"/>
+          <w:sz w:val="27"/>
+          <w:szCs w:val="27"/>
+          <w:lang w:eastAsia="en-IN"/>
+          <w14:ligatures w14:val="none"/>
+        </w:rPr>
+        <w:t>ALTER</w:t>
+      </w:r>
+      <w:r>
+        <w:rPr>
+          <w:rFonts w:ascii="Consolas" w:eastAsia="Times New Roman" w:hAnsi="Consolas" w:cs="Times New Roman"/>
+          <w:color w:val="CCCCCC"/>
+          <w:kern w:val="0"/>
+          <w:sz w:val="27"/>
+          <w:szCs w:val="27"/>
+          <w:lang w:eastAsia="en-IN"/>
+          <w14:ligatures w14:val="none"/>
+        </w:rPr>
+        <w:t xml:space="preserve"> </w:t>
+      </w:r>
+      <w:r>
+        <w:rPr>
+          <w:rFonts w:ascii="Consolas" w:eastAsia="Times New Roman" w:hAnsi="Consolas" w:cs="Times New Roman"/>
+          <w:color w:val="569CD6"/>
+          <w:kern w:val="0"/>
+          <w:sz w:val="27"/>
+          <w:szCs w:val="27"/>
+          <w:lang w:eastAsia="en-IN"/>
+          <w14:ligatures w14:val="none"/>
+        </w:rPr>
+        <w:t>TABLE</w:t>
+      </w:r>
+      <w:r>
+        <w:rPr>
+          <w:rFonts w:ascii="Consolas" w:eastAsia="Times New Roman" w:hAnsi="Consolas" w:cs="Times New Roman"/>
+          <w:color w:val="CCCCCC"/>
+          <w:kern w:val="0"/>
+          <w:sz w:val="27"/>
+          <w:szCs w:val="27"/>
+          <w:lang w:eastAsia="en-IN"/>
+          <w14:ligatures w14:val="none"/>
+        </w:rPr>
+        <w:t xml:space="preserve"> Orders</w:t>
+      </w:r>
+    </w:p>
+    <w:p>
+      <w:pPr>
+        <w:shd w:val="clear" w:color="auto" w:fill="1F1F1F"/>
+        <w:spacing w:after="0" w:line="360" w:lineRule="atLeast"/>
+        <w:rPr>
+          <w:rFonts w:ascii="Consolas" w:eastAsia="Times New Roman" w:hAnsi="Consolas" w:cs="Times New Roman"/>
+          <w:color w:val="CCCCCC"/>
+          <w:kern w:val="0"/>
+          <w:sz w:val="27"/>
+          <w:szCs w:val="27"/>
+          <w:lang w:eastAsia="en-IN"/>
+          <w14:ligatures w14:val="none"/>
+        </w:rPr>
+      </w:pPr>
+      <w:r>
+        <w:rPr>
+          <w:rFonts w:ascii="Consolas" w:eastAsia="Times New Roman" w:hAnsi="Consolas" w:cs="Times New Roman"/>
+          <w:color w:val="569CD6"/>
+          <w:kern w:val="0"/>
+          <w:sz w:val="27"/>
+          <w:szCs w:val="27"/>
+          <w:lang w:eastAsia="en-IN"/>
+          <w14:ligatures w14:val="none"/>
+        </w:rPr>
+        <w:t>ADD</w:t>
+      </w:r>
+      <w:r>
+        <w:rPr>
+          <w:rFonts w:ascii="Consolas" w:eastAsia="Times New Roman" w:hAnsi="Consolas" w:cs="Times New Roman"/>
+          <w:color w:val="CCCCCC"/>
+          <w:kern w:val="0"/>
+          <w:sz w:val="27"/>
+          <w:szCs w:val="27"/>
+          <w:lang w:eastAsia="en-IN"/>
+          <w14:ligatures w14:val="none"/>
+        </w:rPr>
+        <w:t xml:space="preserve"> </w:t>
+      </w:r>
+      <w:r>
+        <w:rPr>
+          <w:rFonts w:ascii="Consolas" w:eastAsia="Times New Roman" w:hAnsi="Consolas" w:cs="Times New Roman"/>
+          <w:color w:val="569CD6"/>
+          <w:kern w:val="0"/>
+          <w:sz w:val="27"/>
+          <w:szCs w:val="27"/>
+          <w:lang w:eastAsia="en-IN"/>
+          <w14:ligatures w14:val="none"/>
+        </w:rPr>
+        <w:t>FOREIGN KEY</w:t>
+      </w:r>
+      <w:r>
+        <w:rPr>
+          <w:rFonts w:ascii="Consolas" w:eastAsia="Times New Roman" w:hAnsi="Consolas" w:cs="Times New Roman"/>
+          <w:color w:val="CCCCCC"/>
+          <w:kern w:val="0"/>
+          <w:sz w:val="27"/>
+          <w:szCs w:val="27"/>
+          <w:lang w:eastAsia="en-IN"/>
+          <w14:ligatures w14:val="none"/>
+        </w:rPr>
+        <w:t xml:space="preserve"> (</w:t>
+      </w:r>
+      <w:proofErr w:type="spellStart"/>
+      <w:r>
+        <w:rPr>
+          <w:rFonts w:ascii="Consolas" w:eastAsia="Times New Roman" w:hAnsi="Consolas" w:cs="Times New Roman"/>
+          <w:color w:val="CCCCCC"/>
+          <w:kern w:val="0"/>
+          <w:sz w:val="27"/>
+          <w:szCs w:val="27"/>
+          <w:lang w:eastAsia="en-IN"/>
+          <w14:ligatures w14:val="none"/>
+        </w:rPr>
+        <w:t>PersonID</w:t>
+      </w:r>
+      <w:proofErr w:type="spellEnd"/>
+      <w:r>
+        <w:rPr>
+          <w:rFonts w:ascii="Consolas" w:eastAsia="Times New Roman" w:hAnsi="Consolas" w:cs="Times New Roman"/>
+          <w:color w:val="CCCCCC"/>
+          <w:kern w:val="0"/>
+          <w:sz w:val="27"/>
+          <w:szCs w:val="27"/>
+          <w:lang w:eastAsia="en-IN"/>
+          <w14:ligatures w14:val="none"/>
+        </w:rPr>
+        <w:t xml:space="preserve">) </w:t>
+      </w:r>
+      <w:r>
+        <w:rPr>
+          <w:rFonts w:ascii="Consolas" w:eastAsia="Times New Roman" w:hAnsi="Consolas" w:cs="Times New Roman"/>
+          <w:color w:val="569CD6"/>
+          <w:kern w:val="0"/>
+          <w:sz w:val="27"/>
+          <w:szCs w:val="27"/>
+          <w:lang w:eastAsia="en-IN"/>
+          <w14:ligatures w14:val="none"/>
+        </w:rPr>
+        <w:t>REFERENCES</w:t>
+      </w:r>
+      <w:r>
+        <w:rPr>
+          <w:rFonts w:ascii="Consolas" w:eastAsia="Times New Roman" w:hAnsi="Consolas" w:cs="Times New Roman"/>
+          <w:color w:val="CCCCCC"/>
+          <w:kern w:val="0"/>
+          <w:sz w:val="27"/>
+          <w:szCs w:val="27"/>
+          <w:lang w:eastAsia="en-IN"/>
+          <w14:ligatures w14:val="none"/>
+        </w:rPr>
+        <w:t xml:space="preserve"> Persons(</w:t>
+      </w:r>
+      <w:proofErr w:type="spellStart"/>
+      <w:r>
+        <w:rPr>
+          <w:rFonts w:ascii="Consolas" w:eastAsia="Times New Roman" w:hAnsi="Consolas" w:cs="Times New Roman"/>
+          <w:color w:val="CCCCCC"/>
+          <w:kern w:val="0"/>
+          <w:sz w:val="27"/>
+          <w:szCs w:val="27"/>
+          <w:lang w:eastAsia="en-IN"/>
+          <w14:ligatures w14:val="none"/>
+        </w:rPr>
+        <w:t>PersonID</w:t>
+      </w:r>
+      <w:proofErr w:type="spellEnd"/>
+      <w:r>
+        <w:rPr>
+          <w:rFonts w:ascii="Consolas" w:eastAsia="Times New Roman" w:hAnsi="Consolas" w:cs="Times New Roman"/>
+          <w:color w:val="CCCCCC"/>
+          <w:kern w:val="0"/>
+          <w:sz w:val="27"/>
+          <w:szCs w:val="27"/>
+          <w:lang w:eastAsia="en-IN"/>
+          <w14:ligatures w14:val="none"/>
+        </w:rPr>
+        <w:t>);</w:t>
+      </w:r>
+    </w:p>
+    <w:p>
+      <w:pPr>
+        <w:pStyle w:val="ListParagraph"/>
+        <w:numPr>
+          <w:ilvl w:val="0"/>
+          <w:numId w:val="7"/>
+        </w:numPr>
+        <w:rPr>
+          <w:rFonts w:ascii="Times New Roman" w:hAnsi="Times New Roman" w:cs="Times New Roman"/>
+          <w:sz w:val="28"/>
+          <w:szCs w:val="28"/>
+        </w:rPr>
+      </w:pPr>
+      <w:r>
+        <w:rPr>
+          <w:rFonts w:ascii="Times New Roman" w:hAnsi="Times New Roman" w:cs="Times New Roman"/>
+          <w:sz w:val="28"/>
+          <w:szCs w:val="28"/>
+        </w:rPr>
+        <w:t>Join</w:t>
+      </w:r>
+    </w:p>
+    <w:p>
+      <w:pPr>
+        <w:shd w:val="clear" w:color="auto" w:fill="1F1F1F"/>
+        <w:spacing w:after="0" w:line="360" w:lineRule="atLeast"/>
+        <w:rPr>
+          <w:rFonts w:ascii="Consolas" w:eastAsia="Times New Roman" w:hAnsi="Consolas" w:cs="Times New Roman"/>
+          <w:color w:val="CCCCCC"/>
+          <w:kern w:val="0"/>
+          <w:sz w:val="27"/>
+          <w:szCs w:val="27"/>
+          <w:lang w:eastAsia="en-IN"/>
+          <w14:ligatures w14:val="none"/>
+        </w:rPr>
+      </w:pPr>
+      <w:r>
+        <w:rPr>
+          <w:rFonts w:ascii="Consolas" w:eastAsia="Times New Roman" w:hAnsi="Consolas" w:cs="Times New Roman"/>
+          <w:color w:val="569CD6"/>
+          <w:kern w:val="0"/>
+          <w:sz w:val="27"/>
+          <w:szCs w:val="27"/>
+          <w:lang w:eastAsia="en-IN"/>
+          <w14:ligatures w14:val="none"/>
+        </w:rPr>
+        <w:t>SELECT</w:t>
+      </w:r>
+      <w:r>
+        <w:rPr>
+          <w:rFonts w:ascii="Consolas" w:eastAsia="Times New Roman" w:hAnsi="Consolas" w:cs="Times New Roman"/>
+          <w:color w:val="CCCCCC"/>
+          <w:kern w:val="0"/>
+          <w:sz w:val="27"/>
+          <w:szCs w:val="27"/>
+          <w:lang w:eastAsia="en-IN"/>
+          <w14:ligatures w14:val="none"/>
+        </w:rPr>
+        <w:t xml:space="preserve"> </w:t>
+      </w:r>
+    </w:p>
+    <w:p>
+      <w:pPr>
+        <w:shd w:val="clear" w:color="auto" w:fill="1F1F1F"/>
+        <w:spacing w:after="0" w:line="360" w:lineRule="atLeast"/>
+        <w:rPr>
+          <w:rFonts w:ascii="Consolas" w:eastAsia="Times New Roman" w:hAnsi="Consolas" w:cs="Times New Roman"/>
+          <w:color w:val="CCCCCC"/>
+          <w:kern w:val="0"/>
+          <w:sz w:val="27"/>
+          <w:szCs w:val="27"/>
+          <w:lang w:eastAsia="en-IN"/>
+          <w14:ligatures w14:val="none"/>
+        </w:rPr>
+      </w:pPr>
+      <w:r>
+        <w:rPr>
+          <w:rFonts w:ascii="Consolas" w:eastAsia="Times New Roman" w:hAnsi="Consolas" w:cs="Times New Roman"/>
+          <w:color w:val="CCCCCC"/>
+          <w:kern w:val="0"/>
+          <w:sz w:val="27"/>
+          <w:szCs w:val="27"/>
+          <w:lang w:eastAsia="en-IN"/>
+          <w14:ligatures w14:val="none"/>
+        </w:rPr>
+        <w:t xml:space="preserve">    </w:t>
+      </w:r>
+      <w:proofErr w:type="spellStart"/>
+      <w:r>
+        <w:rPr>
+          <w:rFonts w:ascii="Consolas" w:eastAsia="Times New Roman" w:hAnsi="Consolas" w:cs="Times New Roman"/>
+          <w:color w:val="CCCCCC"/>
+          <w:kern w:val="0"/>
+          <w:sz w:val="27"/>
+          <w:szCs w:val="27"/>
+          <w:lang w:eastAsia="en-IN"/>
+          <w14:ligatures w14:val="none"/>
+        </w:rPr>
+        <w:t>Orders.OrderID</w:t>
+      </w:r>
+      <w:proofErr w:type="spellEnd"/>
+      <w:r>
+        <w:rPr>
+          <w:rFonts w:ascii="Consolas" w:eastAsia="Times New Roman" w:hAnsi="Consolas" w:cs="Times New Roman"/>
+          <w:color w:val="CCCCCC"/>
+          <w:kern w:val="0"/>
+          <w:sz w:val="27"/>
+          <w:szCs w:val="27"/>
+          <w:lang w:eastAsia="en-IN"/>
+          <w14:ligatures w14:val="none"/>
+        </w:rPr>
+        <w:t xml:space="preserve">, </w:t>
+      </w:r>
+    </w:p>
+    <w:p>
+      <w:pPr>
+        <w:shd w:val="clear" w:color="auto" w:fill="1F1F1F"/>
+        <w:spacing w:after="0" w:line="360" w:lineRule="atLeast"/>
+        <w:rPr>
+          <w:rFonts w:ascii="Consolas" w:eastAsia="Times New Roman" w:hAnsi="Consolas" w:cs="Times New Roman"/>
+          <w:color w:val="CCCCCC"/>
+          <w:kern w:val="0"/>
+          <w:sz w:val="27"/>
+          <w:szCs w:val="27"/>
+          <w:lang w:eastAsia="en-IN"/>
+          <w14:ligatures w14:val="none"/>
+        </w:rPr>
+      </w:pPr>
+      <w:r>
+        <w:rPr>
+          <w:rFonts w:ascii="Consolas" w:eastAsia="Times New Roman" w:hAnsi="Consolas" w:cs="Times New Roman"/>
+          <w:color w:val="CCCCCC"/>
+          <w:kern w:val="0"/>
+          <w:sz w:val="27"/>
+          <w:szCs w:val="27"/>
+          <w:lang w:eastAsia="en-IN"/>
+          <w14:ligatures w14:val="none"/>
+        </w:rPr>
+        <w:t xml:space="preserve">    </w:t>
+      </w:r>
+      <w:proofErr w:type="spellStart"/>
+      <w:r>
+        <w:rPr>
+          <w:rFonts w:ascii="Consolas" w:eastAsia="Times New Roman" w:hAnsi="Consolas" w:cs="Times New Roman"/>
+          <w:color w:val="CCCCCC"/>
+          <w:kern w:val="0"/>
+          <w:sz w:val="27"/>
+          <w:szCs w:val="27"/>
+          <w:lang w:eastAsia="en-IN"/>
+          <w14:ligatures w14:val="none"/>
+        </w:rPr>
+        <w:t>Customers.first_name</w:t>
+      </w:r>
+      <w:proofErr w:type="spellEnd"/>
+      <w:r>
+        <w:rPr>
+          <w:rFonts w:ascii="Consolas" w:eastAsia="Times New Roman" w:hAnsi="Consolas" w:cs="Times New Roman"/>
+          <w:color w:val="CCCCCC"/>
+          <w:kern w:val="0"/>
+          <w:sz w:val="27"/>
+          <w:szCs w:val="27"/>
+          <w:lang w:eastAsia="en-IN"/>
+          <w14:ligatures w14:val="none"/>
+        </w:rPr>
+        <w:t xml:space="preserve">, </w:t>
+      </w:r>
+    </w:p>
+    <w:p>
+      <w:pPr>
+        <w:shd w:val="clear" w:color="auto" w:fill="1F1F1F"/>
+        <w:spacing w:after="0" w:line="360" w:lineRule="atLeast"/>
+        <w:rPr>
+          <w:rFonts w:ascii="Consolas" w:eastAsia="Times New Roman" w:hAnsi="Consolas" w:cs="Times New Roman"/>
+          <w:color w:val="CCCCCC"/>
+          <w:kern w:val="0"/>
+          <w:sz w:val="27"/>
+          <w:szCs w:val="27"/>
+          <w:lang w:eastAsia="en-IN"/>
+          <w14:ligatures w14:val="none"/>
+        </w:rPr>
+      </w:pPr>
+      <w:r>
+        <w:rPr>
+          <w:rFonts w:ascii="Consolas" w:eastAsia="Times New Roman" w:hAnsi="Consolas" w:cs="Times New Roman"/>
+          <w:color w:val="CCCCCC"/>
+          <w:kern w:val="0"/>
+          <w:sz w:val="27"/>
+          <w:szCs w:val="27"/>
+          <w:lang w:eastAsia="en-IN"/>
+          <w14:ligatures w14:val="none"/>
+        </w:rPr>
+        <w:t xml:space="preserve">    </w:t>
+      </w:r>
+      <w:proofErr w:type="spellStart"/>
+      <w:r>
+        <w:rPr>
+          <w:rFonts w:ascii="Consolas" w:eastAsia="Times New Roman" w:hAnsi="Consolas" w:cs="Times New Roman"/>
+          <w:color w:val="CCCCCC"/>
+          <w:kern w:val="0"/>
+          <w:sz w:val="27"/>
+          <w:szCs w:val="27"/>
+          <w:lang w:eastAsia="en-IN"/>
+          <w14:ligatures w14:val="none"/>
+        </w:rPr>
+        <w:t>Customers.last_name</w:t>
+      </w:r>
+      <w:proofErr w:type="spellEnd"/>
+      <w:r>
+        <w:rPr>
+          <w:rFonts w:ascii="Consolas" w:eastAsia="Times New Roman" w:hAnsi="Consolas" w:cs="Times New Roman"/>
+          <w:color w:val="CCCCCC"/>
+          <w:kern w:val="0"/>
+          <w:sz w:val="27"/>
+          <w:szCs w:val="27"/>
+          <w:lang w:eastAsia="en-IN"/>
+          <w14:ligatures w14:val="none"/>
+        </w:rPr>
+        <w:t xml:space="preserve">, </w:t>
+      </w:r>
+    </w:p>
+    <w:p>
+      <w:pPr>
+        <w:shd w:val="clear" w:color="auto" w:fill="1F1F1F"/>
+        <w:spacing w:after="0" w:line="360" w:lineRule="atLeast"/>
+        <w:rPr>
+          <w:rFonts w:ascii="Consolas" w:eastAsia="Times New Roman" w:hAnsi="Consolas" w:cs="Times New Roman"/>
+          <w:color w:val="CCCCCC"/>
+          <w:kern w:val="0"/>
+          <w:sz w:val="27"/>
+          <w:szCs w:val="27"/>
+          <w:lang w:eastAsia="en-IN"/>
+          <w14:ligatures w14:val="none"/>
+        </w:rPr>
+      </w:pPr>
+      <w:r>
+        <w:rPr>
+          <w:rFonts w:ascii="Consolas" w:eastAsia="Times New Roman" w:hAnsi="Consolas" w:cs="Times New Roman"/>
+          <w:color w:val="CCCCCC"/>
+          <w:kern w:val="0"/>
+          <w:sz w:val="27"/>
+          <w:szCs w:val="27"/>
+          <w:lang w:eastAsia="en-IN"/>
+          <w14:ligatures w14:val="none"/>
+        </w:rPr>
+        <w:t xml:space="preserve">    </w:t>
+      </w:r>
+      <w:proofErr w:type="spellStart"/>
+      <w:r>
+        <w:rPr>
+          <w:rFonts w:ascii="Consolas" w:eastAsia="Times New Roman" w:hAnsi="Consolas" w:cs="Times New Roman"/>
+          <w:color w:val="CCCCCC"/>
+          <w:kern w:val="0"/>
+          <w:sz w:val="27"/>
+          <w:szCs w:val="27"/>
+          <w:lang w:eastAsia="en-IN"/>
+          <w14:ligatures w14:val="none"/>
+        </w:rPr>
+        <w:t>Customers.address</w:t>
+      </w:r>
+      <w:proofErr w:type="spellEnd"/>
+    </w:p>
+    <w:p>
+      <w:pPr>
+        <w:shd w:val="clear" w:color="auto" w:fill="1F1F1F"/>
+        <w:spacing w:after="0" w:line="360" w:lineRule="atLeast"/>
+        <w:rPr>
+          <w:rFonts w:ascii="Consolas" w:eastAsia="Times New Roman" w:hAnsi="Consolas" w:cs="Times New Roman"/>
+          <w:color w:val="CCCCCC"/>
+          <w:kern w:val="0"/>
+          <w:sz w:val="27"/>
+          <w:szCs w:val="27"/>
+          <w:lang w:eastAsia="en-IN"/>
+          <w14:ligatures w14:val="none"/>
+        </w:rPr>
+      </w:pPr>
+      <w:r>
+        <w:rPr>
+          <w:rFonts w:ascii="Consolas" w:eastAsia="Times New Roman" w:hAnsi="Consolas" w:cs="Times New Roman"/>
+          <w:color w:val="569CD6"/>
+          <w:kern w:val="0"/>
+          <w:sz w:val="27"/>
+          <w:szCs w:val="27"/>
+          <w:lang w:eastAsia="en-IN"/>
+          <w14:ligatures w14:val="none"/>
+        </w:rPr>
+        <w:t>FROM</w:t>
+      </w:r>
+      <w:r>
+        <w:rPr>
+          <w:rFonts w:ascii="Consolas" w:eastAsia="Times New Roman" w:hAnsi="Consolas" w:cs="Times New Roman"/>
+          <w:color w:val="CCCCCC"/>
+          <w:kern w:val="0"/>
+          <w:sz w:val="27"/>
+          <w:szCs w:val="27"/>
+          <w:lang w:eastAsia="en-IN"/>
+          <w14:ligatures w14:val="none"/>
+        </w:rPr>
+        <w:t xml:space="preserve"> Orders </w:t>
+      </w:r>
+    </w:p>
+    <w:p>
+      <w:pPr>
+        <w:shd w:val="clear" w:color="auto" w:fill="1F1F1F"/>
+        <w:spacing w:after="0" w:line="360" w:lineRule="atLeast"/>
+        <w:rPr>
+          <w:rFonts w:ascii="Consolas" w:eastAsia="Times New Roman" w:hAnsi="Consolas" w:cs="Times New Roman"/>
+          <w:color w:val="CCCCCC"/>
+          <w:kern w:val="0"/>
+          <w:sz w:val="27"/>
+          <w:szCs w:val="27"/>
+          <w:lang w:eastAsia="en-IN"/>
+          <w14:ligatures w14:val="none"/>
+        </w:rPr>
+      </w:pPr>
+      <w:r>
+        <w:rPr>
+          <w:rFonts w:ascii="Consolas" w:eastAsia="Times New Roman" w:hAnsi="Consolas" w:cs="Times New Roman"/>
+          <w:color w:val="569CD6"/>
+          <w:kern w:val="0"/>
+          <w:sz w:val="27"/>
+          <w:szCs w:val="27"/>
+          <w:lang w:eastAsia="en-IN"/>
+          <w14:ligatures w14:val="none"/>
+        </w:rPr>
+        <w:t>INNER JOIN</w:t>
+      </w:r>
+      <w:r>
+        <w:rPr>
+          <w:rFonts w:ascii="Consolas" w:eastAsia="Times New Roman" w:hAnsi="Consolas" w:cs="Times New Roman"/>
+          <w:color w:val="CCCCCC"/>
+          <w:kern w:val="0"/>
+          <w:sz w:val="27"/>
+          <w:szCs w:val="27"/>
+          <w:lang w:eastAsia="en-IN"/>
+          <w14:ligatures w14:val="none"/>
+        </w:rPr>
+        <w:t xml:space="preserve"> Customers </w:t>
+      </w:r>
+      <w:r>
+        <w:rPr>
+          <w:rFonts w:ascii="Consolas" w:eastAsia="Times New Roman" w:hAnsi="Consolas" w:cs="Times New Roman"/>
+          <w:color w:val="569CD6"/>
+          <w:kern w:val="0"/>
+          <w:sz w:val="27"/>
+          <w:szCs w:val="27"/>
+          <w:lang w:eastAsia="en-IN"/>
+          <w14:ligatures w14:val="none"/>
+        </w:rPr>
+        <w:t>ON</w:t>
+      </w:r>
+      <w:r>
+        <w:rPr>
+          <w:rFonts w:ascii="Consolas" w:eastAsia="Times New Roman" w:hAnsi="Consolas" w:cs="Times New Roman"/>
+          <w:color w:val="CCCCCC"/>
+          <w:kern w:val="0"/>
+          <w:sz w:val="27"/>
+          <w:szCs w:val="27"/>
+          <w:lang w:eastAsia="en-IN"/>
+          <w14:ligatures w14:val="none"/>
+        </w:rPr>
+        <w:t xml:space="preserve"> </w:t>
+      </w:r>
+      <w:proofErr w:type="spellStart"/>
+      <w:r>
+        <w:rPr>
+          <w:rFonts w:ascii="Consolas" w:eastAsia="Times New Roman" w:hAnsi="Consolas" w:cs="Times New Roman"/>
+          <w:color w:val="CCCCCC"/>
+          <w:kern w:val="0"/>
+          <w:sz w:val="27"/>
+          <w:szCs w:val="27"/>
+          <w:lang w:eastAsia="en-IN"/>
+          <w14:ligatures w14:val="none"/>
+        </w:rPr>
+        <w:t>O</w:t>
+      </w:r>
+      <w:r>
+        <w:rPr>
+          <w:rFonts w:ascii="Consolas" w:eastAsia="Times New Roman" w:hAnsi="Consolas" w:cs="Times New Roman"/>
+          <w:color w:val="CCCCCC"/>
+          <w:kern w:val="0"/>
+          <w:sz w:val="27"/>
+          <w:szCs w:val="27"/>
+          <w:lang w:eastAsia="en-IN"/>
+          <w14:ligatures w14:val="none"/>
+        </w:rPr>
+        <w:t>rders.customer_id</w:t>
+      </w:r>
+      <w:proofErr w:type="spellEnd"/>
+      <w:r>
+        <w:rPr>
+          <w:rFonts w:ascii="Consolas" w:eastAsia="Times New Roman" w:hAnsi="Consolas" w:cs="Times New Roman"/>
+          <w:color w:val="CCCCCC"/>
+          <w:kern w:val="0"/>
+          <w:sz w:val="27"/>
+          <w:szCs w:val="27"/>
+          <w:lang w:eastAsia="en-IN"/>
+          <w14:ligatures w14:val="none"/>
+        </w:rPr>
+        <w:t xml:space="preserve"> </w:t>
+      </w:r>
+      <w:r>
+        <w:rPr>
+          <w:rFonts w:ascii="Consolas" w:eastAsia="Times New Roman" w:hAnsi="Consolas" w:cs="Times New Roman"/>
+          <w:color w:val="D4D4D4"/>
+          <w:kern w:val="0"/>
+          <w:sz w:val="27"/>
+          <w:szCs w:val="27"/>
+          <w:lang w:eastAsia="en-IN"/>
+          <w14:ligatures w14:val="none"/>
+        </w:rPr>
+        <w:t>=</w:t>
+      </w:r>
+      <w:r>
+        <w:rPr>
+          <w:rFonts w:ascii="Consolas" w:eastAsia="Times New Roman" w:hAnsi="Consolas" w:cs="Times New Roman"/>
+          <w:color w:val="CCCCCC"/>
+          <w:kern w:val="0"/>
+          <w:sz w:val="27"/>
+          <w:szCs w:val="27"/>
+          <w:lang w:eastAsia="en-IN"/>
+          <w14:ligatures w14:val="none"/>
+        </w:rPr>
+        <w:t xml:space="preserve"> </w:t>
+      </w:r>
+      <w:r>
+        <w:rPr>
+          <w:rFonts w:ascii="Consolas" w:eastAsia="Times New Roman" w:hAnsi="Consolas" w:cs="Times New Roman"/>
+          <w:color w:val="CCCCCC"/>
+          <w:kern w:val="0"/>
+          <w:sz w:val="27"/>
+          <w:szCs w:val="27"/>
+          <w:lang w:eastAsia="en-IN"/>
+          <w14:ligatures w14:val="none"/>
+        </w:rPr>
+        <w:t>C</w:t>
+      </w:r>
+      <w:r>
+        <w:rPr>
+          <w:rFonts w:ascii="Consolas" w:eastAsia="Times New Roman" w:hAnsi="Consolas" w:cs="Times New Roman"/>
+          <w:color w:val="CCCCCC"/>
+          <w:kern w:val="0"/>
+          <w:sz w:val="27"/>
+          <w:szCs w:val="27"/>
+          <w:lang w:eastAsia="en-IN"/>
+          <w14:ligatures w14:val="none"/>
+        </w:rPr>
+        <w:t>ustomers.id;</w:t>
+      </w:r>
     </w:p>
     <w:sectPr>
       <w:pgSz w:w="11906" w:h="16838"/>
@@ -2023,7 +3336,7 @@
   <w:abstractNum w:abstractNumId="5" w15:restartNumberingAfterBreak="0">
     <w:nsid w:val="532336D2"/>
     <w:multiLevelType w:val="hybridMultilevel"/>
-    <w:tmpl w:val="BE4CF460"/>
+    <w:tmpl w:val="C7187E1A"/>
     <w:lvl w:ilvl="0" w:tplc="40090001">
       <w:start w:val="1"/>
       <w:numFmt w:val="bullet"/>
@@ -2732,6 +4045,18 @@
       <w:contextualSpacing/>
     </w:pPr>
   </w:style>
+  <w:style w:type="character" w:styleId="FollowedHyperlink">
+    <w:name w:val="FollowedHyperlink"/>
+    <w:basedOn w:val="DefaultParagraphFont"/>
+    <w:uiPriority w:val="99"/>
+    <w:semiHidden/>
+    <w:unhideWhenUsed/>
+    <w:rsid w:val="00C4702E"/>
+    <w:rPr>
+      <w:color w:val="954F72" w:themeColor="followedHyperlink"/>
+      <w:u w:val="single"/>
+    </w:rPr>
+  </w:style>
 </w:styles>
 </file>
 

</xml_diff>